<commit_message>
EH'YEH to Bereshit - Start Shemot
Copy in all verses for the book Bereshit
Fix Footer for some files.... not all
</commit_message>
<xml_diff>
--- a/02 Habrit Khadasha/40 Mattai/Mattai 01.docx
+++ b/02 Habrit Khadasha/40 Mattai/Mattai 01.docx
@@ -816,15 +816,29 @@
 <w:ftr xmlns:mc="http://schemas.openxmlformats.org/markup-compatibility/2006" xmlns:o="urn:schemas-microsoft-com:office:office" xmlns:r="http://schemas.openxmlformats.org/officeDocument/2006/relationships" xmlns:m="http://schemas.openxmlformats.org/officeDocument/2006/math" xmlns:v="urn:schemas-microsoft-com:vml" xmlns:wp="http://schemas.openxmlformats.org/drawingml/2006/wordprocessingDrawing" xmlns:w10="urn:schemas-microsoft-com:office:word" xmlns:w="http://schemas.openxmlformats.org/wordprocessingml/2006/main" xmlns:wne="http://schemas.microsoft.com/office/word/2006/wordml" xmlns:sl="http://schemas.openxmlformats.org/schemaLibrary/2006/main" xmlns:a="http://schemas.openxmlformats.org/drawingml/2006/main" xmlns:pic="http://schemas.openxmlformats.org/drawingml/2006/picture" xmlns:c="http://schemas.openxmlformats.org/drawingml/2006/chart" xmlns:lc="http://schemas.openxmlformats.org/drawingml/2006/lockedCanvas" xmlns:dgm="http://schemas.openxmlformats.org/drawingml/2006/diagram" xmlns:wps="http://schemas.microsoft.com/office/word/2010/wordprocessingShape" xmlns:wpg="http://schemas.microsoft.com/office/word/2010/wordprocessingGroup" xmlns:w14="http://schemas.microsoft.com/office/word/2010/wordml" xmlns:w15="http://schemas.microsoft.com/office/word/2012/wordml" xmlns:w16="http://schemas.microsoft.com/office/word/2018/wordml" xmlns:w16cex="http://schemas.microsoft.com/office/word/2018/wordml/cex" xmlns:w16cid="http://schemas.microsoft.com/office/word/2016/wordml/cid" xmlns="http://schemas.microsoft.com/office/tasks/2019/documenttasks" xmlns:cr="http://schemas.microsoft.com/office/comments/2020/reactions">
   <w:p>
     <w:pPr>
+      <w:bidi w:val="1"/>
       <w:ind w:left="720" w:firstLine="0"/>
       <w:jc w:val="center"/>
       <w:rPr>
-        <w:sz w:val="18"/>
-        <w:szCs w:val="18"/>
+        <w:sz w:val="20"/>
+        <w:szCs w:val="20"/>
       </w:rPr>
     </w:pPr>
     <w:r>
       <w:rPr>
+        <w:rtl w:val="0"/>
+      </w:rPr>
+    </w:r>
+    <w:r>
+      <w:rPr>
+        <w:sz w:val="20"/>
+        <w:szCs w:val="20"/>
+        <w:rtl w:val="1"/>
+      </w:rPr>
+      <w:t xml:space="preserve">     </w:t>
+    </w:r>
+    <w:r>
+      <w:rPr>
         <w:sz w:val="20"/>
         <w:szCs w:val="20"/>
         <w:rtl w:val="1"/>
@@ -1059,7 +1073,7 @@
       <w:rPr>
         <w:sz w:val="20"/>
         <w:szCs w:val="20"/>
-        <w:rtl w:val="0"/>
+        <w:rtl w:val="1"/>
       </w:rPr>
       <w:t xml:space="preserve">         </w:t>
       <w:tab/>

</xml_diff>